<commit_message>
docs: release 1.3.1 pubblicata (versione ponte, sito Cloudflare verificato)
Co-Authored-By: Claude Opus 5.5 <noreply@anthropic.com>
</commit_message>
<xml_diff>
--- a/docs/PDFz_20261023.docx
+++ b/docs/PDFz_20261023.docx
@@ -16,7 +16,7 @@
           <w:noProof/>
         </w:rPr>
         <w:drawing>
-          <wp:inline distT="0" distB="0" distL="0" distR="0" wp14:anchorId="38C942E9" wp14:editId="1C18C0A9">
+          <wp:inline distT="0" distB="0" distL="0" distR="0" wp14:anchorId="3E1FDD9D" wp14:editId="6785AA3F">
             <wp:extent cx="3619500" cy="1285875"/>
             <wp:effectExtent l="0" t="0" r="0" b="0"/>
             <wp:docPr id="1" name="Immagine 1"/>
@@ -129,14 +129,13 @@
           <w:sz w:val="32"/>
           <w:szCs w:val="32"/>
         </w:rPr>
-        <w:lastRenderedPageBreak/>
         <w:t>Indice</w:t>
       </w:r>
     </w:p>
     <w:sdt>
       <w:sdtPr>
         <w:alias w:val="Indice"/>
-        <w:id w:val="925227981"/>
+        <w:id w:val="1381519661"/>
       </w:sdtPr>
       <w:sdtEndPr/>
       <w:sdtContent>
@@ -159,7 +158,7 @@
           <w:r>
             <w:fldChar w:fldCharType="separate"/>
           </w:r>
-          <w:hyperlink w:anchor="_Toc243648770" w:history="1">
+          <w:hyperlink w:anchor="_Toc243650661" w:history="1">
             <w:r>
               <w:rPr>
                 <w:rStyle w:val="Collegamentoipertestuale"/>
@@ -183,7 +182,7 @@
               <w:rPr>
                 <w:noProof/>
               </w:rPr>
-              <w:instrText xml:space="preserve"> PAGEREF _Toc243648770 \h </w:instrText>
+              <w:instrText xml:space="preserve"> PAGEREF _Toc243650661 \h </w:instrText>
             </w:r>
             <w:r>
               <w:rPr>
@@ -220,7 +219,7 @@
               <w:noProof/>
             </w:rPr>
           </w:pPr>
-          <w:hyperlink w:anchor="_Toc243648771" w:history="1">
+          <w:hyperlink w:anchor="_Toc243650662" w:history="1">
             <w:r>
               <w:rPr>
                 <w:rStyle w:val="Collegamentoipertestuale"/>
@@ -244,7 +243,7 @@
               <w:rPr>
                 <w:noProof/>
               </w:rPr>
-              <w:instrText xml:space="preserve"> PAGEREF _Toc243648771 \h </w:instrText>
+              <w:instrText xml:space="preserve"> PAGEREF _Toc243650662 \h </w:instrText>
             </w:r>
             <w:r>
               <w:rPr>
@@ -281,7 +280,7 @@
               <w:noProof/>
             </w:rPr>
           </w:pPr>
-          <w:hyperlink w:anchor="_Toc243648772" w:history="1">
+          <w:hyperlink w:anchor="_Toc243650663" w:history="1">
             <w:r>
               <w:rPr>
                 <w:rStyle w:val="Collegamentoipertestuale"/>
@@ -305,7 +304,7 @@
               <w:rPr>
                 <w:noProof/>
               </w:rPr>
-              <w:instrText xml:space="preserve"> PAGEREF _Toc243648772 \h </w:instrText>
+              <w:instrText xml:space="preserve"> PAGEREF _Toc243650663 \h </w:instrText>
             </w:r>
             <w:r>
               <w:rPr>
@@ -342,7 +341,7 @@
               <w:noProof/>
             </w:rPr>
           </w:pPr>
-          <w:hyperlink w:anchor="_Toc243648773" w:history="1">
+          <w:hyperlink w:anchor="_Toc243650664" w:history="1">
             <w:r>
               <w:rPr>
                 <w:rStyle w:val="Collegamentoipertestuale"/>
@@ -366,7 +365,7 @@
               <w:rPr>
                 <w:noProof/>
               </w:rPr>
-              <w:instrText xml:space="preserve"> PAGEREF _Toc243648773 \h </w:instrText>
+              <w:instrText xml:space="preserve"> PAGEREF _Toc243650664 \h </w:instrText>
             </w:r>
             <w:r>
               <w:rPr>
@@ -403,7 +402,7 @@
               <w:noProof/>
             </w:rPr>
           </w:pPr>
-          <w:hyperlink w:anchor="_Toc243648774" w:history="1">
+          <w:hyperlink w:anchor="_Toc243650665" w:history="1">
             <w:r>
               <w:rPr>
                 <w:rStyle w:val="Collegamentoipertestuale"/>
@@ -427,7 +426,7 @@
               <w:rPr>
                 <w:noProof/>
               </w:rPr>
-              <w:instrText xml:space="preserve"> PAGEREF _Toc243648774 \h </w:instrText>
+              <w:instrText xml:space="preserve"> PAGEREF _Toc243650665 \h </w:instrText>
             </w:r>
             <w:r>
               <w:rPr>
@@ -464,7 +463,7 @@
               <w:noProof/>
             </w:rPr>
           </w:pPr>
-          <w:hyperlink w:anchor="_Toc243648775" w:history="1">
+          <w:hyperlink w:anchor="_Toc243650666" w:history="1">
             <w:r>
               <w:rPr>
                 <w:rStyle w:val="Collegamentoipertestuale"/>
@@ -488,7 +487,7 @@
               <w:rPr>
                 <w:noProof/>
               </w:rPr>
-              <w:instrText xml:space="preserve"> PAGEREF _Toc243648775 \h </w:instrText>
+              <w:instrText xml:space="preserve"> PAGEREF _Toc243650666 \h </w:instrText>
             </w:r>
             <w:r>
               <w:rPr>
@@ -525,7 +524,7 @@
               <w:noProof/>
             </w:rPr>
           </w:pPr>
-          <w:hyperlink w:anchor="_Toc243648776" w:history="1">
+          <w:hyperlink w:anchor="_Toc243650667" w:history="1">
             <w:r>
               <w:rPr>
                 <w:rStyle w:val="Collegamentoipertestuale"/>
@@ -549,7 +548,7 @@
               <w:rPr>
                 <w:noProof/>
               </w:rPr>
-              <w:instrText xml:space="preserve"> PAGEREF _Toc243648776 \h </w:instrText>
+              <w:instrText xml:space="preserve"> PAGEREF _Toc243650667 \h </w:instrText>
             </w:r>
             <w:r>
               <w:rPr>
@@ -586,7 +585,7 @@
               <w:noProof/>
             </w:rPr>
           </w:pPr>
-          <w:hyperlink w:anchor="_Toc243648777" w:history="1">
+          <w:hyperlink w:anchor="_Toc243650668" w:history="1">
             <w:r>
               <w:rPr>
                 <w:rStyle w:val="Collegamentoipertestuale"/>
@@ -610,7 +609,7 @@
               <w:rPr>
                 <w:noProof/>
               </w:rPr>
-              <w:instrText xml:space="preserve"> PAGEREF _Toc243648777 \h </w:instrText>
+              <w:instrText xml:space="preserve"> PAGEREF _Toc243650668 \h </w:instrText>
             </w:r>
             <w:r>
               <w:rPr>
@@ -647,7 +646,7 @@
               <w:noProof/>
             </w:rPr>
           </w:pPr>
-          <w:hyperlink w:anchor="_Toc243648778" w:history="1">
+          <w:hyperlink w:anchor="_Toc243650669" w:history="1">
             <w:r>
               <w:rPr>
                 <w:rStyle w:val="Collegamentoipertestuale"/>
@@ -671,7 +670,7 @@
               <w:rPr>
                 <w:noProof/>
               </w:rPr>
-              <w:instrText xml:space="preserve"> PAGEREF _Toc243648778 \h </w:instrText>
+              <w:instrText xml:space="preserve"> PAGEREF _Toc243650669 \h </w:instrText>
             </w:r>
             <w:r>
               <w:rPr>
@@ -708,7 +707,7 @@
               <w:noProof/>
             </w:rPr>
           </w:pPr>
-          <w:hyperlink w:anchor="_Toc243648779" w:history="1">
+          <w:hyperlink w:anchor="_Toc243650670" w:history="1">
             <w:r>
               <w:rPr>
                 <w:rStyle w:val="Collegamentoipertestuale"/>
@@ -732,7 +731,7 @@
               <w:rPr>
                 <w:noProof/>
               </w:rPr>
-              <w:instrText xml:space="preserve"> PAGEREF _Toc243648779 \h </w:instrText>
+              <w:instrText xml:space="preserve"> PAGEREF _Toc243650670 \h </w:instrText>
             </w:r>
             <w:r>
               <w:rPr>
@@ -769,7 +768,7 @@
               <w:noProof/>
             </w:rPr>
           </w:pPr>
-          <w:hyperlink w:anchor="_Toc243648780" w:history="1">
+          <w:hyperlink w:anchor="_Toc243650671" w:history="1">
             <w:r>
               <w:rPr>
                 <w:rStyle w:val="Collegamentoipertestuale"/>
@@ -793,7 +792,7 @@
               <w:rPr>
                 <w:noProof/>
               </w:rPr>
-              <w:instrText xml:space="preserve"> PAGEREF _Toc243648780 \h </w:instrText>
+              <w:instrText xml:space="preserve"> PAGEREF _Toc243650671 \h </w:instrText>
             </w:r>
             <w:r>
               <w:rPr>
@@ -830,7 +829,7 @@
               <w:noProof/>
             </w:rPr>
           </w:pPr>
-          <w:hyperlink w:anchor="_Toc243648781" w:history="1">
+          <w:hyperlink w:anchor="_Toc243650672" w:history="1">
             <w:r>
               <w:rPr>
                 <w:rStyle w:val="Collegamentoipertestuale"/>
@@ -854,7 +853,7 @@
               <w:rPr>
                 <w:noProof/>
               </w:rPr>
-              <w:instrText xml:space="preserve"> PAGEREF _Toc243648781 \h </w:instrText>
+              <w:instrText xml:space="preserve"> PAGEREF _Toc243650672 \h </w:instrText>
             </w:r>
             <w:r>
               <w:rPr>
@@ -891,7 +890,7 @@
               <w:noProof/>
             </w:rPr>
           </w:pPr>
-          <w:hyperlink w:anchor="_Toc243648782" w:history="1">
+          <w:hyperlink w:anchor="_Toc243650673" w:history="1">
             <w:r>
               <w:rPr>
                 <w:rStyle w:val="Collegamentoipertestuale"/>
@@ -915,7 +914,7 @@
               <w:rPr>
                 <w:noProof/>
               </w:rPr>
-              <w:instrText xml:space="preserve"> PAGEREF _Toc243648782 \h </w:instrText>
+              <w:instrText xml:space="preserve"> PAGEREF _Toc243650673 \h </w:instrText>
             </w:r>
             <w:r>
               <w:rPr>
@@ -952,7 +951,7 @@
               <w:noProof/>
             </w:rPr>
           </w:pPr>
-          <w:hyperlink w:anchor="_Toc243648783" w:history="1">
+          <w:hyperlink w:anchor="_Toc243650674" w:history="1">
             <w:r>
               <w:rPr>
                 <w:rStyle w:val="Collegamentoipertestuale"/>
@@ -976,7 +975,7 @@
               <w:rPr>
                 <w:noProof/>
               </w:rPr>
-              <w:instrText xml:space="preserve"> PAGEREF _Toc243648783 \h </w:instrText>
+              <w:instrText xml:space="preserve"> PAGEREF _Toc243650674 \h </w:instrText>
             </w:r>
             <w:r>
               <w:rPr>
@@ -1013,7 +1012,7 @@
               <w:noProof/>
             </w:rPr>
           </w:pPr>
-          <w:hyperlink w:anchor="_Toc243648784" w:history="1">
+          <w:hyperlink w:anchor="_Toc243650675" w:history="1">
             <w:r>
               <w:rPr>
                 <w:rStyle w:val="Collegamentoipertestuale"/>
@@ -1037,7 +1036,7 @@
               <w:rPr>
                 <w:noProof/>
               </w:rPr>
-              <w:instrText xml:space="preserve"> PAGEREF _Toc243648784 \h </w:instrText>
+              <w:instrText xml:space="preserve"> PAGEREF _Toc243650675 \h </w:instrText>
             </w:r>
             <w:r>
               <w:rPr>
@@ -1074,7 +1073,7 @@
               <w:noProof/>
             </w:rPr>
           </w:pPr>
-          <w:hyperlink w:anchor="_Toc243648785" w:history="1">
+          <w:hyperlink w:anchor="_Toc243650676" w:history="1">
             <w:r>
               <w:rPr>
                 <w:rStyle w:val="Collegamentoipertestuale"/>
@@ -1098,7 +1097,7 @@
               <w:rPr>
                 <w:noProof/>
               </w:rPr>
-              <w:instrText xml:space="preserve"> PAGEREF _Toc243648785 \h </w:instrText>
+              <w:instrText xml:space="preserve"> PAGEREF _Toc243650676 \h </w:instrText>
             </w:r>
             <w:r>
               <w:rPr>
@@ -1135,7 +1134,7 @@
               <w:noProof/>
             </w:rPr>
           </w:pPr>
-          <w:hyperlink w:anchor="_Toc243648786" w:history="1">
+          <w:hyperlink w:anchor="_Toc243650677" w:history="1">
             <w:r>
               <w:rPr>
                 <w:rStyle w:val="Collegamentoipertestuale"/>
@@ -1159,7 +1158,7 @@
               <w:rPr>
                 <w:noProof/>
               </w:rPr>
-              <w:instrText xml:space="preserve"> PAGEREF _Toc243648786 \h </w:instrText>
+              <w:instrText xml:space="preserve"> PAGEREF _Toc243650677 \h </w:instrText>
             </w:r>
             <w:r>
               <w:rPr>
@@ -1196,7 +1195,7 @@
               <w:noProof/>
             </w:rPr>
           </w:pPr>
-          <w:hyperlink w:anchor="_Toc243648787" w:history="1">
+          <w:hyperlink w:anchor="_Toc243650678" w:history="1">
             <w:r>
               <w:rPr>
                 <w:rStyle w:val="Collegamentoipertestuale"/>
@@ -1220,7 +1219,7 @@
               <w:rPr>
                 <w:noProof/>
               </w:rPr>
-              <w:instrText xml:space="preserve"> PAGEREF _Toc243648787 \h </w:instrText>
+              <w:instrText xml:space="preserve"> PAGEREF _Toc243650678 \h </w:instrText>
             </w:r>
             <w:r>
               <w:rPr>
@@ -1257,7 +1256,7 @@
               <w:noProof/>
             </w:rPr>
           </w:pPr>
-          <w:hyperlink w:anchor="_Toc243648788" w:history="1">
+          <w:hyperlink w:anchor="_Toc243650679" w:history="1">
             <w:r>
               <w:rPr>
                 <w:rStyle w:val="Collegamentoipertestuale"/>
@@ -1281,7 +1280,7 @@
               <w:rPr>
                 <w:noProof/>
               </w:rPr>
-              <w:instrText xml:space="preserve"> PAGEREF _Toc243648788 \h </w:instrText>
+              <w:instrText xml:space="preserve"> PAGEREF _Toc243650679 \h </w:instrText>
             </w:r>
             <w:r>
               <w:rPr>
@@ -1318,7 +1317,7 @@
               <w:noProof/>
             </w:rPr>
           </w:pPr>
-          <w:hyperlink w:anchor="_Toc243648789" w:history="1">
+          <w:hyperlink w:anchor="_Toc243650680" w:history="1">
             <w:r>
               <w:rPr>
                 <w:rStyle w:val="Collegamentoipertestuale"/>
@@ -1342,7 +1341,7 @@
               <w:rPr>
                 <w:noProof/>
               </w:rPr>
-              <w:instrText xml:space="preserve"> PAGEREF _Toc243648789 \h </w:instrText>
+              <w:instrText xml:space="preserve"> PAGEREF _Toc243650680 \h </w:instrText>
             </w:r>
             <w:r>
               <w:rPr>
@@ -1379,7 +1378,7 @@
               <w:noProof/>
             </w:rPr>
           </w:pPr>
-          <w:hyperlink w:anchor="_Toc243648790" w:history="1">
+          <w:hyperlink w:anchor="_Toc243650681" w:history="1">
             <w:r>
               <w:rPr>
                 <w:rStyle w:val="Collegamentoipertestuale"/>
@@ -1403,7 +1402,7 @@
               <w:rPr>
                 <w:noProof/>
               </w:rPr>
-              <w:instrText xml:space="preserve"> PAGEREF _Toc243648790 \h </w:instrText>
+              <w:instrText xml:space="preserve"> PAGEREF _Toc243650681 \h </w:instrText>
             </w:r>
             <w:r>
               <w:rPr>
@@ -1440,7 +1439,7 @@
               <w:noProof/>
             </w:rPr>
           </w:pPr>
-          <w:hyperlink w:anchor="_Toc243648791" w:history="1">
+          <w:hyperlink w:anchor="_Toc243650682" w:history="1">
             <w:r>
               <w:rPr>
                 <w:rStyle w:val="Collegamentoipertestuale"/>
@@ -1464,7 +1463,7 @@
               <w:rPr>
                 <w:noProof/>
               </w:rPr>
-              <w:instrText xml:space="preserve"> PAGEREF _Toc243648791 \h </w:instrText>
+              <w:instrText xml:space="preserve"> PAGEREF _Toc243650682 \h </w:instrText>
             </w:r>
             <w:r>
               <w:rPr>
@@ -1501,7 +1500,7 @@
               <w:noProof/>
             </w:rPr>
           </w:pPr>
-          <w:hyperlink w:anchor="_Toc243648792" w:history="1">
+          <w:hyperlink w:anchor="_Toc243650683" w:history="1">
             <w:r>
               <w:rPr>
                 <w:rStyle w:val="Collegamentoipertestuale"/>
@@ -1525,7 +1524,7 @@
               <w:rPr>
                 <w:noProof/>
               </w:rPr>
-              <w:instrText xml:space="preserve"> PAGEREF _Toc243648792 \h </w:instrText>
+              <w:instrText xml:space="preserve"> PAGEREF _Toc243650683 \h </w:instrText>
             </w:r>
             <w:r>
               <w:rPr>
@@ -1562,7 +1561,7 @@
               <w:noProof/>
             </w:rPr>
           </w:pPr>
-          <w:hyperlink w:anchor="_Toc243648793" w:history="1">
+          <w:hyperlink w:anchor="_Toc243650684" w:history="1">
             <w:r>
               <w:rPr>
                 <w:rStyle w:val="Collegamentoipertestuale"/>
@@ -1586,7 +1585,7 @@
               <w:rPr>
                 <w:noProof/>
               </w:rPr>
-              <w:instrText xml:space="preserve"> PAGEREF _Toc243648793 \h </w:instrText>
+              <w:instrText xml:space="preserve"> PAGEREF _Toc243650684 \h </w:instrText>
             </w:r>
             <w:r>
               <w:rPr>
@@ -1623,7 +1622,7 @@
               <w:noProof/>
             </w:rPr>
           </w:pPr>
-          <w:hyperlink w:anchor="_Toc243648794" w:history="1">
+          <w:hyperlink w:anchor="_Toc243650685" w:history="1">
             <w:r>
               <w:rPr>
                 <w:rStyle w:val="Collegamentoipertestuale"/>
@@ -1647,7 +1646,7 @@
               <w:rPr>
                 <w:noProof/>
               </w:rPr>
-              <w:instrText xml:space="preserve"> PAGEREF _Toc243648794 \h </w:instrText>
+              <w:instrText xml:space="preserve"> PAGEREF _Toc243650685 \h </w:instrText>
             </w:r>
             <w:r>
               <w:rPr>
@@ -1684,7 +1683,7 @@
               <w:noProof/>
             </w:rPr>
           </w:pPr>
-          <w:hyperlink w:anchor="_Toc243648795" w:history="1">
+          <w:hyperlink w:anchor="_Toc243650686" w:history="1">
             <w:r>
               <w:rPr>
                 <w:rStyle w:val="Collegamentoipertestuale"/>
@@ -1708,7 +1707,7 @@
               <w:rPr>
                 <w:noProof/>
               </w:rPr>
-              <w:instrText xml:space="preserve"> PAGEREF _Toc243648795 \h </w:instrText>
+              <w:instrText xml:space="preserve"> PAGEREF _Toc243650686 \h </w:instrText>
             </w:r>
             <w:r>
               <w:rPr>
@@ -1745,7 +1744,7 @@
               <w:noProof/>
             </w:rPr>
           </w:pPr>
-          <w:hyperlink w:anchor="_Toc243648796" w:history="1">
+          <w:hyperlink w:anchor="_Toc243650687" w:history="1">
             <w:r>
               <w:rPr>
                 <w:rStyle w:val="Collegamentoipertestuale"/>
@@ -1769,7 +1768,7 @@
               <w:rPr>
                 <w:noProof/>
               </w:rPr>
-              <w:instrText xml:space="preserve"> PAGEREF _Toc243648796 \h </w:instrText>
+              <w:instrText xml:space="preserve"> PAGEREF _Toc243650687 \h </w:instrText>
             </w:r>
             <w:r>
               <w:rPr>
@@ -1806,7 +1805,7 @@
               <w:noProof/>
             </w:rPr>
           </w:pPr>
-          <w:hyperlink w:anchor="_Toc243648797" w:history="1">
+          <w:hyperlink w:anchor="_Toc243650688" w:history="1">
             <w:r>
               <w:rPr>
                 <w:rStyle w:val="Collegamentoipertestuale"/>
@@ -1830,7 +1829,7 @@
               <w:rPr>
                 <w:noProof/>
               </w:rPr>
-              <w:instrText xml:space="preserve"> PAGEREF _Toc243648797 \h </w:instrText>
+              <w:instrText xml:space="preserve"> PAGEREF _Toc243650688 \h </w:instrText>
             </w:r>
             <w:r>
               <w:rPr>
@@ -1867,7 +1866,7 @@
               <w:noProof/>
             </w:rPr>
           </w:pPr>
-          <w:hyperlink w:anchor="_Toc243648798" w:history="1">
+          <w:hyperlink w:anchor="_Toc243650689" w:history="1">
             <w:r>
               <w:rPr>
                 <w:rStyle w:val="Collegamentoipertestuale"/>
@@ -1891,7 +1890,7 @@
               <w:rPr>
                 <w:noProof/>
               </w:rPr>
-              <w:instrText xml:space="preserve"> PAGEREF _Toc243648798 \h </w:instrText>
+              <w:instrText xml:space="preserve"> PAGEREF _Toc243650689 \h </w:instrText>
             </w:r>
             <w:r>
               <w:rPr>
@@ -1928,7 +1927,7 @@
               <w:noProof/>
             </w:rPr>
           </w:pPr>
-          <w:hyperlink w:anchor="_Toc243648799" w:history="1">
+          <w:hyperlink w:anchor="_Toc243650690" w:history="1">
             <w:r>
               <w:rPr>
                 <w:rStyle w:val="Collegamentoipertestuale"/>
@@ -1952,7 +1951,7 @@
               <w:rPr>
                 <w:noProof/>
               </w:rPr>
-              <w:instrText xml:space="preserve"> PAGEREF _Toc243648799 \h </w:instrText>
+              <w:instrText xml:space="preserve"> PAGEREF _Toc243650690 \h </w:instrText>
             </w:r>
             <w:r>
               <w:rPr>
@@ -1989,7 +1988,7 @@
               <w:noProof/>
             </w:rPr>
           </w:pPr>
-          <w:hyperlink w:anchor="_Toc243648800" w:history="1">
+          <w:hyperlink w:anchor="_Toc243650691" w:history="1">
             <w:r>
               <w:rPr>
                 <w:rStyle w:val="Collegamentoipertestuale"/>
@@ -2013,7 +2012,7 @@
               <w:rPr>
                 <w:noProof/>
               </w:rPr>
-              <w:instrText xml:space="preserve"> PAGEREF _Toc243648800 \h </w:instrText>
+              <w:instrText xml:space="preserve"> PAGEREF _Toc243650691 \h </w:instrText>
             </w:r>
             <w:r>
               <w:rPr>
@@ -2050,7 +2049,7 @@
               <w:noProof/>
             </w:rPr>
           </w:pPr>
-          <w:hyperlink w:anchor="_Toc243648801" w:history="1">
+          <w:hyperlink w:anchor="_Toc243650692" w:history="1">
             <w:r>
               <w:rPr>
                 <w:rStyle w:val="Collegamentoipertestuale"/>
@@ -2074,7 +2073,7 @@
               <w:rPr>
                 <w:noProof/>
               </w:rPr>
-              <w:instrText xml:space="preserve"> PAGEREF _Toc243648801 \h </w:instrText>
+              <w:instrText xml:space="preserve"> PAGEREF _Toc243650692 \h </w:instrText>
             </w:r>
             <w:r>
               <w:rPr>
@@ -2111,7 +2110,7 @@
               <w:noProof/>
             </w:rPr>
           </w:pPr>
-          <w:hyperlink w:anchor="_Toc243648802" w:history="1">
+          <w:hyperlink w:anchor="_Toc243650693" w:history="1">
             <w:r>
               <w:rPr>
                 <w:rStyle w:val="Collegamentoipertestuale"/>
@@ -2135,7 +2134,7 @@
               <w:rPr>
                 <w:noProof/>
               </w:rPr>
-              <w:instrText xml:space="preserve"> PAGEREF _Toc243648802 \h </w:instrText>
+              <w:instrText xml:space="preserve"> PAGEREF _Toc243650693 \h </w:instrText>
             </w:r>
             <w:r>
               <w:rPr>
@@ -2172,7 +2171,7 @@
               <w:noProof/>
             </w:rPr>
           </w:pPr>
-          <w:hyperlink w:anchor="_Toc243648803" w:history="1">
+          <w:hyperlink w:anchor="_Toc243650694" w:history="1">
             <w:r>
               <w:rPr>
                 <w:rStyle w:val="Collegamentoipertestuale"/>
@@ -2196,7 +2195,7 @@
               <w:rPr>
                 <w:noProof/>
               </w:rPr>
-              <w:instrText xml:space="preserve"> PAGEREF _Toc243648803 \h </w:instrText>
+              <w:instrText xml:space="preserve"> PAGEREF _Toc243650694 \h </w:instrText>
             </w:r>
             <w:r>
               <w:rPr>
@@ -2233,7 +2232,7 @@
               <w:noProof/>
             </w:rPr>
           </w:pPr>
-          <w:hyperlink w:anchor="_Toc243648804" w:history="1">
+          <w:hyperlink w:anchor="_Toc243650695" w:history="1">
             <w:r>
               <w:rPr>
                 <w:rStyle w:val="Collegamentoipertestuale"/>
@@ -2257,7 +2256,7 @@
               <w:rPr>
                 <w:noProof/>
               </w:rPr>
-              <w:instrText xml:space="preserve"> PAGEREF _Toc243648804 \h </w:instrText>
+              <w:instrText xml:space="preserve"> PAGEREF _Toc243650695 \h </w:instrText>
             </w:r>
             <w:r>
               <w:rPr>
@@ -2294,7 +2293,7 @@
               <w:noProof/>
             </w:rPr>
           </w:pPr>
-          <w:hyperlink w:anchor="_Toc243648805" w:history="1">
+          <w:hyperlink w:anchor="_Toc243650696" w:history="1">
             <w:r>
               <w:rPr>
                 <w:rStyle w:val="Collegamentoipertestuale"/>
@@ -2318,7 +2317,7 @@
               <w:rPr>
                 <w:noProof/>
               </w:rPr>
-              <w:instrText xml:space="preserve"> PAGEREF _Toc243648805 \h </w:instrText>
+              <w:instrText xml:space="preserve"> PAGEREF _Toc243650696 \h </w:instrText>
             </w:r>
             <w:r>
               <w:rPr>
@@ -2355,7 +2354,7 @@
               <w:noProof/>
             </w:rPr>
           </w:pPr>
-          <w:hyperlink w:anchor="_Toc243648806" w:history="1">
+          <w:hyperlink w:anchor="_Toc243650697" w:history="1">
             <w:r>
               <w:rPr>
                 <w:rStyle w:val="Collegamentoipertestuale"/>
@@ -2379,7 +2378,7 @@
               <w:rPr>
                 <w:noProof/>
               </w:rPr>
-              <w:instrText xml:space="preserve"> PAGEREF _Toc243648806 \h </w:instrText>
+              <w:instrText xml:space="preserve"> PAGEREF _Toc243650697 \h </w:instrText>
             </w:r>
             <w:r>
               <w:rPr>
@@ -2416,7 +2415,7 @@
               <w:noProof/>
             </w:rPr>
           </w:pPr>
-          <w:hyperlink w:anchor="_Toc243648807" w:history="1">
+          <w:hyperlink w:anchor="_Toc243650698" w:history="1">
             <w:r>
               <w:rPr>
                 <w:rStyle w:val="Collegamentoipertestuale"/>
@@ -2440,7 +2439,7 @@
               <w:rPr>
                 <w:noProof/>
               </w:rPr>
-              <w:instrText xml:space="preserve"> PAGEREF _Toc243648807 \h </w:instrText>
+              <w:instrText xml:space="preserve"> PAGEREF _Toc243650698 \h </w:instrText>
             </w:r>
             <w:r>
               <w:rPr>
@@ -2477,7 +2476,7 @@
               <w:noProof/>
             </w:rPr>
           </w:pPr>
-          <w:hyperlink w:anchor="_Toc243648808" w:history="1">
+          <w:hyperlink w:anchor="_Toc243650699" w:history="1">
             <w:r>
               <w:rPr>
                 <w:rStyle w:val="Collegamentoipertestuale"/>
@@ -2501,7 +2500,7 @@
               <w:rPr>
                 <w:noProof/>
               </w:rPr>
-              <w:instrText xml:space="preserve"> PAGEREF _Toc243648808 \h </w:instrText>
+              <w:instrText xml:space="preserve"> PAGEREF _Toc243650699 \h </w:instrText>
             </w:r>
             <w:r>
               <w:rPr>
@@ -2538,7 +2537,7 @@
               <w:noProof/>
             </w:rPr>
           </w:pPr>
-          <w:hyperlink w:anchor="_Toc243648809" w:history="1">
+          <w:hyperlink w:anchor="_Toc243650700" w:history="1">
             <w:r>
               <w:rPr>
                 <w:rStyle w:val="Collegamentoipertestuale"/>
@@ -2562,7 +2561,7 @@
               <w:rPr>
                 <w:noProof/>
               </w:rPr>
-              <w:instrText xml:space="preserve"> PAGEREF _Toc243648809 \h </w:instrText>
+              <w:instrText xml:space="preserve"> PAGEREF _Toc243650700 \h </w:instrText>
             </w:r>
             <w:r>
               <w:rPr>
@@ -2599,7 +2598,7 @@
               <w:noProof/>
             </w:rPr>
           </w:pPr>
-          <w:hyperlink w:anchor="_Toc243648810" w:history="1">
+          <w:hyperlink w:anchor="_Toc243650701" w:history="1">
             <w:r>
               <w:rPr>
                 <w:rStyle w:val="Collegamentoipertestuale"/>
@@ -2623,7 +2622,7 @@
               <w:rPr>
                 <w:noProof/>
               </w:rPr>
-              <w:instrText xml:space="preserve"> PAGEREF _Toc243648810 \h </w:instrText>
+              <w:instrText xml:space="preserve"> PAGEREF _Toc243650701 \h </w:instrText>
             </w:r>
             <w:r>
               <w:rPr>
@@ -2660,7 +2659,7 @@
               <w:noProof/>
             </w:rPr>
           </w:pPr>
-          <w:hyperlink w:anchor="_Toc243648811" w:history="1">
+          <w:hyperlink w:anchor="_Toc243650702" w:history="1">
             <w:r>
               <w:rPr>
                 <w:rStyle w:val="Collegamentoipertestuale"/>
@@ -2684,7 +2683,7 @@
               <w:rPr>
                 <w:noProof/>
               </w:rPr>
-              <w:instrText xml:space="preserve"> PAGEREF _Toc243648811 \h </w:instrText>
+              <w:instrText xml:space="preserve"> PAGEREF _Toc243650702 \h </w:instrText>
             </w:r>
             <w:r>
               <w:rPr>
@@ -2721,7 +2720,7 @@
               <w:noProof/>
             </w:rPr>
           </w:pPr>
-          <w:hyperlink w:anchor="_Toc243648812" w:history="1">
+          <w:hyperlink w:anchor="_Toc243650703" w:history="1">
             <w:r>
               <w:rPr>
                 <w:rStyle w:val="Collegamentoipertestuale"/>
@@ -2745,7 +2744,7 @@
               <w:rPr>
                 <w:noProof/>
               </w:rPr>
-              <w:instrText xml:space="preserve"> PAGEREF _Toc243648812 \h </w:instrText>
+              <w:instrText xml:space="preserve"> PAGEREF _Toc243650703 \h </w:instrText>
             </w:r>
             <w:r>
               <w:rPr>
@@ -2782,7 +2781,7 @@
               <w:noProof/>
             </w:rPr>
           </w:pPr>
-          <w:hyperlink w:anchor="_Toc243648813" w:history="1">
+          <w:hyperlink w:anchor="_Toc243650704" w:history="1">
             <w:r>
               <w:rPr>
                 <w:rStyle w:val="Collegamentoipertestuale"/>
@@ -2806,7 +2805,7 @@
               <w:rPr>
                 <w:noProof/>
               </w:rPr>
-              <w:instrText xml:space="preserve"> PAGEREF _Toc243648813 \h </w:instrText>
+              <w:instrText xml:space="preserve"> PAGEREF _Toc243650704 \h </w:instrText>
             </w:r>
             <w:r>
               <w:rPr>
@@ -2843,7 +2842,7 @@
               <w:noProof/>
             </w:rPr>
           </w:pPr>
-          <w:hyperlink w:anchor="_Toc243648814" w:history="1">
+          <w:hyperlink w:anchor="_Toc243650705" w:history="1">
             <w:r>
               <w:rPr>
                 <w:rStyle w:val="Collegamentoipertestuale"/>
@@ -2867,7 +2866,7 @@
               <w:rPr>
                 <w:noProof/>
               </w:rPr>
-              <w:instrText xml:space="preserve"> PAGEREF _Toc243648814 \h </w:instrText>
+              <w:instrText xml:space="preserve"> PAGEREF _Toc243650705 \h </w:instrText>
             </w:r>
             <w:r>
               <w:rPr>
@@ -2884,7 +2883,7 @@
               <w:rPr>
                 <w:noProof/>
               </w:rPr>
-              <w:t>23</w:t>
+              <w:t>24</w:t>
             </w:r>
             <w:r>
               <w:rPr>
@@ -2904,7 +2903,7 @@
               <w:noProof/>
             </w:rPr>
           </w:pPr>
-          <w:hyperlink w:anchor="_Toc243648815" w:history="1">
+          <w:hyperlink w:anchor="_Toc243650706" w:history="1">
             <w:r>
               <w:rPr>
                 <w:rStyle w:val="Collegamentoipertestuale"/>
@@ -2928,7 +2927,7 @@
               <w:rPr>
                 <w:noProof/>
               </w:rPr>
-              <w:instrText xml:space="preserve"> PAGEREF _Toc243648815 \h </w:instrText>
+              <w:instrText xml:space="preserve"> PAGEREF _Toc243650706 \h </w:instrText>
             </w:r>
             <w:r>
               <w:rPr>
@@ -2965,7 +2964,7 @@
               <w:noProof/>
             </w:rPr>
           </w:pPr>
-          <w:hyperlink w:anchor="_Toc243648816" w:history="1">
+          <w:hyperlink w:anchor="_Toc243650707" w:history="1">
             <w:r>
               <w:rPr>
                 <w:rStyle w:val="Collegamentoipertestuale"/>
@@ -2989,7 +2988,7 @@
               <w:rPr>
                 <w:noProof/>
               </w:rPr>
-              <w:instrText xml:space="preserve"> PAGEREF _Toc243648816 \h </w:instrText>
+              <w:instrText xml:space="preserve"> PAGEREF _Toc243650707 \h </w:instrText>
             </w:r>
             <w:r>
               <w:rPr>
@@ -3032,9 +3031,8 @@
       <w:pPr>
         <w:pStyle w:val="Titolo1"/>
       </w:pPr>
-      <w:bookmarkStart w:id="0" w:name="_Toc243648770"/>
-      <w:r>
-        <w:lastRenderedPageBreak/>
+      <w:bookmarkStart w:id="0" w:name="_Toc243650661"/>
+      <w:r>
         <w:t>1. In breve</w:t>
       </w:r>
       <w:bookmarkEnd w:id="0"/>
@@ -3324,7 +3322,7 @@
       <w:pPr>
         <w:pStyle w:val="Titolo1"/>
       </w:pPr>
-      <w:bookmarkStart w:id="1" w:name="_Toc243648771"/>
+      <w:bookmarkStart w:id="1" w:name="_Toc243650662"/>
       <w:r>
         <w:t>2. Nuovo marchio</w:t>
       </w:r>
@@ -3334,7 +3332,7 @@
       <w:pPr>
         <w:pStyle w:val="Titolo2"/>
       </w:pPr>
-      <w:bookmarkStart w:id="2" w:name="_Toc243648772"/>
+      <w:bookmarkStart w:id="2" w:name="_Toc243650663"/>
       <w:r>
         <w:t>2.1 Nomi e identificativi</w:t>
       </w:r>
@@ -3880,9 +3878,8 @@
       <w:pPr>
         <w:pStyle w:val="Titolo2"/>
       </w:pPr>
-      <w:bookmarkStart w:id="3" w:name="_Toc243648773"/>
-      <w:r>
-        <w:lastRenderedPageBreak/>
+      <w:bookmarkStart w:id="3" w:name="_Toc243650664"/>
+      <w:r>
         <w:t>2.2 Colori</w:t>
       </w:r>
       <w:bookmarkEnd w:id="3"/>
@@ -4276,7 +4273,7 @@
       <w:pPr>
         <w:pStyle w:val="Titolo2"/>
       </w:pPr>
-      <w:bookmarkStart w:id="4" w:name="_Toc243648774"/>
+      <w:bookmarkStart w:id="4" w:name="_Toc243650665"/>
       <w:r>
         <w:t>2.3 Icona in uso: 24 «Foglio senza fondo» (serie 6, 22 ottobre)</w:t>
       </w:r>
@@ -4310,7 +4307,7 @@
           <w:noProof/>
         </w:rPr>
         <w:drawing>
-          <wp:inline distT="0" distB="0" distL="0" distR="0" wp14:anchorId="7CA3C8F7" wp14:editId="3261A710">
+          <wp:inline distT="0" distB="0" distL="0" distR="0" wp14:anchorId="0DE12767" wp14:editId="11B15F35">
             <wp:extent cx="3429000" cy="4000500"/>
             <wp:effectExtent l="0" t="0" r="0" b="0"/>
             <wp:docPr id="2" name="Immagine 2"/>
@@ -4369,7 +4366,7 @@
       <w:pPr>
         <w:pStyle w:val="Titolo2"/>
       </w:pPr>
-      <w:bookmarkStart w:id="5" w:name="_Toc243648775"/>
+      <w:bookmarkStart w:id="5" w:name="_Toc243650666"/>
       <w:r>
         <w:t>2.4 Serie 4: la 17 «Foglio oro», in uso fino al 21 ottobre</w:t>
       </w:r>
@@ -4402,9 +4399,8 @@
         <w:rPr>
           <w:noProof/>
         </w:rPr>
-        <w:lastRenderedPageBreak/>
         <w:drawing>
-          <wp:inline distT="0" distB="0" distL="0" distR="0" wp14:anchorId="6752EA0D" wp14:editId="72E9DB5F">
+          <wp:inline distT="0" distB="0" distL="0" distR="0" wp14:anchorId="5C9E1DFD" wp14:editId="38F1536B">
             <wp:extent cx="5334000" cy="5895975"/>
             <wp:effectExtent l="0" t="0" r="0" b="0"/>
             <wp:docPr id="3" name="Immagine 3"/>
@@ -4817,7 +4813,7 @@
       <w:pPr>
         <w:pStyle w:val="Titolo2"/>
       </w:pPr>
-      <w:bookmarkStart w:id="6" w:name="_Toc243648776"/>
+      <w:bookmarkStart w:id="6" w:name="_Toc243650667"/>
       <w:r>
         <w:t>2.5 Serie 5: la 17 con più bianco, la 19 in uso il 21 ottobre</w:t>
       </w:r>
@@ -4838,11 +4834,7 @@
         <w:t>Scelta la 19 «Foglio bianco»</w:t>
       </w:r>
       <w:r>
-        <w:t xml:space="preserve"> (21 ottobre), </w:t>
-      </w:r>
-      <w:r>
-        <w:lastRenderedPageBreak/>
-        <w:t>applicata su tutte le piattaforme: icone di Windows, macOS, Linux e Android, favicon, logo, schermate di avvio e immagini dell'installer.</w:t>
+        <w:t xml:space="preserve"> (21 ottobre), applicata su tutte le piattaforme: icone di Windows, macOS, Linux e Android, favicon, logo, schermate di avvio e immagini dell'installer.</w:t>
       </w:r>
     </w:p>
     <w:p>
@@ -4855,7 +4847,7 @@
           <w:noProof/>
         </w:rPr>
         <w:drawing>
-          <wp:inline distT="0" distB="0" distL="0" distR="0" wp14:anchorId="1091C5DF" wp14:editId="4360C751">
+          <wp:inline distT="0" distB="0" distL="0" distR="0" wp14:anchorId="1D1A07EA" wp14:editId="0AAE5FE5">
             <wp:extent cx="5715000" cy="3295650"/>
             <wp:effectExtent l="0" t="0" r="0" b="0"/>
             <wp:docPr id="4" name="Immagine 4"/>
@@ -5402,7 +5394,7 @@
       <w:pPr>
         <w:pStyle w:val="Titolo2"/>
       </w:pPr>
-      <w:bookmarkStart w:id="7" w:name="_Toc243648777"/>
+      <w:bookmarkStart w:id="7" w:name="_Toc243650668"/>
       <w:r>
         <w:t>2.6 Serie 3, non scelta (la 11 è diventata la serie 4)</w:t>
       </w:r>
@@ -5425,9 +5417,8 @@
         <w:rPr>
           <w:noProof/>
         </w:rPr>
-        <w:lastRenderedPageBreak/>
         <w:drawing>
-          <wp:inline distT="0" distB="0" distL="0" distR="0" wp14:anchorId="72CB36F4" wp14:editId="7908283F">
+          <wp:inline distT="0" distB="0" distL="0" distR="0" wp14:anchorId="5EA19D65" wp14:editId="79201749">
             <wp:extent cx="5905500" cy="4133850"/>
             <wp:effectExtent l="0" t="0" r="0" b="0"/>
             <wp:docPr id="5" name="Immagine 5"/>
@@ -6113,7 +6104,7 @@
       <w:pPr>
         <w:pStyle w:val="Titolo2"/>
       </w:pPr>
-      <w:bookmarkStart w:id="8" w:name="_Toc243648778"/>
+      <w:bookmarkStart w:id="8" w:name="_Toc243650669"/>
       <w:r>
         <w:t>2.7 Serie 2, non scelta</w:t>
       </w:r>
@@ -6136,9 +6127,8 @@
         <w:rPr>
           <w:noProof/>
         </w:rPr>
-        <w:lastRenderedPageBreak/>
         <w:drawing>
-          <wp:inline distT="0" distB="0" distL="0" distR="0" wp14:anchorId="48FCF199" wp14:editId="2ACD4609">
+          <wp:inline distT="0" distB="0" distL="0" distR="0" wp14:anchorId="5F2A456D" wp14:editId="73B654D0">
             <wp:extent cx="5905500" cy="4133850"/>
             <wp:effectExtent l="0" t="0" r="0" b="0"/>
             <wp:docPr id="6" name="Immagine 6"/>
@@ -6858,7 +6848,7 @@
       <w:pPr>
         <w:pStyle w:val="Titolo2"/>
       </w:pPr>
-      <w:bookmarkStart w:id="9" w:name="_Toc243648779"/>
+      <w:bookmarkStart w:id="9" w:name="_Toc243650670"/>
       <w:r>
         <w:t>2.8 Serie 1, scartata</w:t>
       </w:r>
@@ -6881,9 +6871,8 @@
         <w:rPr>
           <w:noProof/>
         </w:rPr>
-        <w:lastRenderedPageBreak/>
         <w:drawing>
-          <wp:inline distT="0" distB="0" distL="0" distR="0" wp14:anchorId="20049DBD" wp14:editId="6C2426A9">
+          <wp:inline distT="0" distB="0" distL="0" distR="0" wp14:anchorId="34E0B72F" wp14:editId="2BE05739">
             <wp:extent cx="4000500" cy="2800350"/>
             <wp:effectExtent l="0" t="0" r="0" b="0"/>
             <wp:docPr id="7" name="Immagine 7"/>
@@ -6942,7 +6931,7 @@
       <w:pPr>
         <w:pStyle w:val="Titolo2"/>
       </w:pPr>
-      <w:bookmarkStart w:id="10" w:name="_Toc243648780"/>
+      <w:bookmarkStart w:id="10" w:name="_Toc243650671"/>
       <w:r>
         <w:t>2.9 Verifica dei marchi registrati</w:t>
       </w:r>
@@ -7194,7 +7183,7 @@
       <w:pPr>
         <w:pStyle w:val="Titolo1"/>
       </w:pPr>
-      <w:bookmarkStart w:id="11" w:name="_Toc243648781"/>
+      <w:bookmarkStart w:id="11" w:name="_Toc243650672"/>
       <w:r>
         <w:t>3. Temi colore</w:t>
       </w:r>
@@ -7227,9 +7216,8 @@
         <w:rPr>
           <w:noProof/>
         </w:rPr>
-        <w:lastRenderedPageBreak/>
         <w:drawing>
-          <wp:inline distT="0" distB="0" distL="0" distR="0" wp14:anchorId="41EC1AC7" wp14:editId="19CC2806">
+          <wp:inline distT="0" distB="0" distL="0" distR="0" wp14:anchorId="587EF4AE" wp14:editId="197DA249">
             <wp:extent cx="4572000" cy="3429000"/>
             <wp:effectExtent l="0" t="0" r="0" b="0"/>
             <wp:docPr id="8" name="Immagine 8"/>
@@ -7939,7 +7927,7 @@
       <w:pPr>
         <w:pStyle w:val="Titolo1"/>
       </w:pPr>
-      <w:bookmarkStart w:id="12" w:name="_Toc243648782"/>
+      <w:bookmarkStart w:id="12" w:name="_Toc243650673"/>
       <w:r>
         <w:t>4. Correzione: avvisi «come JavaScript»</w:t>
       </w:r>
@@ -7949,7 +7937,7 @@
       <w:pPr>
         <w:pStyle w:val="Titolo2"/>
       </w:pPr>
-      <w:bookmarkStart w:id="13" w:name="_Toc243648783"/>
+      <w:bookmarkStart w:id="13" w:name="_Toc243650674"/>
       <w:r>
         <w:t>4.1 Il problema</w:t>
       </w:r>
@@ -8352,7 +8340,7 @@
       <w:pPr>
         <w:pStyle w:val="Titolo2"/>
       </w:pPr>
-      <w:bookmarkStart w:id="14" w:name="_Toc243648784"/>
+      <w:bookmarkStart w:id="14" w:name="_Toc243650675"/>
       <w:r>
         <w:t>4.2 La soluzione</w:t>
       </w:r>
@@ -8485,7 +8473,7 @@
           <w:noProof/>
         </w:rPr>
         <w:drawing>
-          <wp:inline distT="0" distB="0" distL="0" distR="0" wp14:anchorId="48283EF4" wp14:editId="4B03E923">
+          <wp:inline distT="0" distB="0" distL="0" distR="0" wp14:anchorId="03C793A7" wp14:editId="1A782BF0">
             <wp:extent cx="4572000" cy="3429000"/>
             <wp:effectExtent l="0" t="0" r="0" b="0"/>
             <wp:docPr id="9" name="Immagine 9"/>
@@ -8544,7 +8532,7 @@
       <w:pPr>
         <w:pStyle w:val="Titolo2"/>
       </w:pPr>
-      <w:bookmarkStart w:id="15" w:name="_Toc243648785"/>
+      <w:bookmarkStart w:id="15" w:name="_Toc243650676"/>
       <w:r>
         <w:t>4.3 Verifiche</w:t>
       </w:r>
@@ -8591,7 +8579,7 @@
       <w:pPr>
         <w:pStyle w:val="Titolo2"/>
       </w:pPr>
-      <w:bookmarkStart w:id="16" w:name="_Toc243648786"/>
+      <w:bookmarkStart w:id="16" w:name="_Toc243650677"/>
       <w:r>
         <w:t>4.4 Android: menu Tema e notifiche (versione 1.0.1)</w:t>
       </w:r>
@@ -8859,7 +8847,6 @@
           </w:tcPr>
           <w:p>
             <w:r>
-              <w:lastRenderedPageBreak/>
               <w:t>Non si leggono tutte le notifiche</w:t>
             </w:r>
           </w:p>
@@ -8927,7 +8914,7 @@
       <w:pPr>
         <w:pStyle w:val="Titolo2"/>
       </w:pPr>
-      <w:bookmarkStart w:id="17" w:name="_Toc243648787"/>
+      <w:bookmarkStart w:id="17" w:name="_Toc243650678"/>
       <w:r>
         <w:t>4.5 App più leggera: traduzione tolta</w:t>
       </w:r>
@@ -9360,7 +9347,7 @@
       <w:pPr>
         <w:pStyle w:val="Titolo2"/>
       </w:pPr>
-      <w:bookmarkStart w:id="18" w:name="_Toc243648788"/>
+      <w:bookmarkStart w:id="18" w:name="_Toc243650679"/>
       <w:r>
         <w:t>4.6 Schede in una nuova finestra</w:t>
       </w:r>
@@ -9478,7 +9465,7 @@
           <w:noProof/>
         </w:rPr>
         <w:drawing>
-          <wp:inline distT="0" distB="0" distL="0" distR="0" wp14:anchorId="7013BD07" wp14:editId="4047A32A">
+          <wp:inline distT="0" distB="0" distL="0" distR="0" wp14:anchorId="0F3A477E" wp14:editId="49D5742E">
             <wp:extent cx="5715000" cy="857250"/>
             <wp:effectExtent l="0" t="0" r="0" b="0"/>
             <wp:docPr id="10" name="Immagine 10"/>
@@ -9676,7 +9663,6 @@
           </w:tcPr>
           <w:p>
             <w:r>
-              <w:lastRenderedPageBreak/>
               <w:t>Linux</w:t>
             </w:r>
           </w:p>
@@ -9768,7 +9754,7 @@
       <w:pPr>
         <w:pStyle w:val="Titolo2"/>
       </w:pPr>
-      <w:bookmarkStart w:id="19" w:name="_Toc243648789"/>
+      <w:bookmarkStart w:id="19" w:name="_Toc243650680"/>
       <w:r>
         <w:t>4.7 Riunire le finestre</w:t>
       </w:r>
@@ -9870,7 +9856,7 @@
       <w:pPr>
         <w:pStyle w:val="Titolo2"/>
       </w:pPr>
-      <w:bookmarkStart w:id="20" w:name="_Toc243648790"/>
+      <w:bookmarkStart w:id="20" w:name="_Toc243650681"/>
       <w:r>
         <w:t>4.8 Correzioni di «Modifica testo»</w:t>
       </w:r>
@@ -10134,9 +10120,8 @@
         <w:rPr>
           <w:noProof/>
         </w:rPr>
-        <w:lastRenderedPageBreak/>
         <w:drawing>
-          <wp:inline distT="0" distB="0" distL="0" distR="0" wp14:anchorId="174B5236" wp14:editId="3F9D8DD3">
+          <wp:inline distT="0" distB="0" distL="0" distR="0" wp14:anchorId="1CD6E686" wp14:editId="7B566609">
             <wp:extent cx="3286125" cy="2286000"/>
             <wp:effectExtent l="0" t="0" r="0" b="0"/>
             <wp:docPr id="11" name="Immagine 11"/>
@@ -10201,7 +10186,7 @@
           <w:noProof/>
         </w:rPr>
         <w:drawing>
-          <wp:inline distT="0" distB="0" distL="0" distR="0" wp14:anchorId="1A56B7F0" wp14:editId="0BDB3554">
+          <wp:inline distT="0" distB="0" distL="0" distR="0" wp14:anchorId="3C9572C9" wp14:editId="4C616B40">
             <wp:extent cx="3286125" cy="2286000"/>
             <wp:effectExtent l="0" t="0" r="0" b="0"/>
             <wp:docPr id="12" name="Immagine 12"/>
@@ -10268,7 +10253,7 @@
       <w:pPr>
         <w:pStyle w:val="Titolo2"/>
       </w:pPr>
-      <w:bookmarkStart w:id="21" w:name="_Toc243648791"/>
+      <w:bookmarkStart w:id="21" w:name="_Toc243650682"/>
       <w:r>
         <w:t>4.9 Web app per iPhone</w:t>
       </w:r>
@@ -10686,7 +10671,6 @@
           <w:bCs/>
           <w:color w:val="3B3632"/>
         </w:rPr>
-        <w:lastRenderedPageBreak/>
         <w:t>Regola (22 ottobre):</w:t>
       </w:r>
       <w:r>
@@ -10708,7 +10692,7 @@
       <w:pPr>
         <w:pStyle w:val="Titolo2"/>
       </w:pPr>
-      <w:bookmarkStart w:id="22" w:name="_Toc243648792"/>
+      <w:bookmarkStart w:id="22" w:name="_Toc243650683"/>
       <w:r>
         <w:t>4.10 Aggiornamenti su Cloudflare (repository privato)</w:t>
       </w:r>
@@ -11222,7 +11206,7 @@
       <w:pPr>
         <w:pStyle w:val="Titolo1"/>
       </w:pPr>
-      <w:bookmarkStart w:id="23" w:name="_Toc243648793"/>
+      <w:bookmarkStart w:id="23" w:name="_Toc243650684"/>
       <w:r>
         <w:t>5. Decisioni</w:t>
       </w:r>
@@ -11240,7 +11224,7 @@
       <w:pPr>
         <w:pStyle w:val="Titolo2"/>
       </w:pPr>
-      <w:bookmarkStart w:id="24" w:name="_Toc243648794"/>
+      <w:bookmarkStart w:id="24" w:name="_Toc243650685"/>
       <w:r>
         <w:t>5.1 Canale degli aggiornamenti</w:t>
       </w:r>
@@ -11459,7 +11443,6 @@
           </w:tcPr>
           <w:p>
             <w:r>
-              <w:lastRenderedPageBreak/>
               <w:t>🆓</w:t>
             </w:r>
             <w:r>
@@ -11748,7 +11731,7 @@
       <w:pPr>
         <w:pStyle w:val="Titolo2"/>
       </w:pPr>
-      <w:bookmarkStart w:id="25" w:name="_Toc243648795"/>
+      <w:bookmarkStart w:id="25" w:name="_Toc243650686"/>
       <w:r>
         <w:t>5.2 Storia del repository</w:t>
       </w:r>
@@ -12255,7 +12238,7 @@
       <w:pPr>
         <w:pStyle w:val="Titolo2"/>
       </w:pPr>
-      <w:bookmarkStart w:id="26" w:name="_Toc243648796"/>
+      <w:bookmarkStart w:id="26" w:name="_Toc243650687"/>
       <w:r>
         <w:t>5.3 Identificativi del prodotto</w:t>
       </w:r>
@@ -12653,7 +12636,6 @@
           </w:tcPr>
           <w:p>
             <w:r>
-              <w:lastRenderedPageBreak/>
               <w:t>Performante</w:t>
             </w:r>
           </w:p>
@@ -12756,7 +12738,7 @@
       <w:pPr>
         <w:pStyle w:val="Titolo2"/>
       </w:pPr>
-      <w:bookmarkStart w:id="27" w:name="_Toc243648797"/>
+      <w:bookmarkStart w:id="27" w:name="_Toc243650688"/>
       <w:r>
         <w:t>5.4 Avvisi e domande</w:t>
       </w:r>
@@ -13263,7 +13245,7 @@
       <w:pPr>
         <w:pStyle w:val="Titolo2"/>
       </w:pPr>
-      <w:bookmarkStart w:id="28" w:name="_Toc243648798"/>
+      <w:bookmarkStart w:id="28" w:name="_Toc243650689"/>
       <w:r>
         <w:t>5.5 Traduzione offline</w:t>
       </w:r>
@@ -13770,7 +13752,7 @@
       <w:pPr>
         <w:pStyle w:val="Titolo2"/>
       </w:pPr>
-      <w:bookmarkStart w:id="29" w:name="_Toc243648799"/>
+      <w:bookmarkStart w:id="29" w:name="_Toc243650690"/>
       <w:r>
         <w:t>5.6 Passaggio della scheda alla nuova finestra</w:t>
       </w:r>
@@ -13836,7 +13818,6 @@
                 <w:bCs/>
                 <w:color w:val="FFFFFF"/>
               </w:rPr>
-              <w:lastRenderedPageBreak/>
               <w:t>Scenario</w:t>
             </w:r>
           </w:p>
@@ -14293,7 +14274,7 @@
       <w:pPr>
         <w:pStyle w:val="Titolo2"/>
       </w:pPr>
-      <w:bookmarkStart w:id="30" w:name="_Toc243648800"/>
+      <w:bookmarkStart w:id="30" w:name="_Toc243650691"/>
       <w:r>
         <w:t>5.7 Come si cancella la riga in «Modifica testo»</w:t>
       </w:r>
@@ -14800,7 +14781,7 @@
       <w:pPr>
         <w:pStyle w:val="Titolo1"/>
       </w:pPr>
-      <w:bookmarkStart w:id="31" w:name="_Toc243648801"/>
+      <w:bookmarkStart w:id="31" w:name="_Toc243650692"/>
       <w:r>
         <w:t>6. Come si lavora</w:t>
       </w:r>
@@ -14810,7 +14791,7 @@
       <w:pPr>
         <w:pStyle w:val="Titolo2"/>
       </w:pPr>
-      <w:bookmarkStart w:id="32" w:name="_Toc243648802"/>
+      <w:bookmarkStart w:id="32" w:name="_Toc243650693"/>
       <w:r>
         <w:t>6.1 Comandi</w:t>
       </w:r>
@@ -14873,7 +14854,6 @@
           <w:sz w:val="18"/>
           <w:szCs w:val="18"/>
         </w:rPr>
-        <w:lastRenderedPageBreak/>
         <w:t>.venv/Scripts/python branding/genera_marchio.py --icona 1 --favicon 1</w:t>
       </w:r>
     </w:p>
@@ -14881,7 +14861,7 @@
       <w:pPr>
         <w:pStyle w:val="Titolo2"/>
       </w:pPr>
-      <w:bookmarkStart w:id="33" w:name="_Toc243648803"/>
+      <w:bookmarkStart w:id="33" w:name="_Toc243650694"/>
       <w:r>
         <w:t>6.2 Pubblicare una versione</w:t>
       </w:r>
@@ -15009,7 +14989,7 @@
       <w:pPr>
         <w:pStyle w:val="Titolo2"/>
       </w:pPr>
-      <w:bookmarkStart w:id="34" w:name="_Toc243648804"/>
+      <w:bookmarkStart w:id="34" w:name="_Toc243650695"/>
       <w:r>
         <w:t>6.3 Release 1.0.0 (pubblicata il 16 ottobre 2026)</w:t>
       </w:r>
@@ -15736,7 +15716,7 @@
       <w:pPr>
         <w:pStyle w:val="Titolo2"/>
       </w:pPr>
-      <w:bookmarkStart w:id="35" w:name="_Toc243648805"/>
+      <w:bookmarkStart w:id="35" w:name="_Toc243650696"/>
       <w:r>
         <w:t>6.4 Release 1.0.1</w:t>
       </w:r>
@@ -15950,7 +15930,6 @@
           </w:tcPr>
           <w:p>
             <w:r>
-              <w:lastRenderedPageBreak/>
               <w:t>Linux</w:t>
             </w:r>
           </w:p>
@@ -16034,7 +16013,7 @@
       <w:pPr>
         <w:pStyle w:val="Titolo2"/>
       </w:pPr>
-      <w:bookmarkStart w:id="36" w:name="_Toc243648806"/>
+      <w:bookmarkStart w:id="36" w:name="_Toc243650697"/>
       <w:r>
         <w:t>6.5 Release 1.0.2 e repository pubblico</w:t>
       </w:r>
@@ -16456,7 +16435,7 @@
       <w:pPr>
         <w:pStyle w:val="Titolo2"/>
       </w:pPr>
-      <w:bookmarkStart w:id="37" w:name="_Toc243648807"/>
+      <w:bookmarkStart w:id="37" w:name="_Toc243650698"/>
       <w:r>
         <w:t>6.6 Nuova versione: link diretto per ogni sistema</w:t>
       </w:r>
@@ -16872,9 +16851,8 @@
         <w:rPr>
           <w:noProof/>
         </w:rPr>
-        <w:lastRenderedPageBreak/>
         <w:drawing>
-          <wp:inline distT="0" distB="0" distL="0" distR="0" wp14:anchorId="73998166" wp14:editId="6306147F">
+          <wp:inline distT="0" distB="0" distL="0" distR="0" wp14:anchorId="505C551C" wp14:editId="0139EB5E">
             <wp:extent cx="4572000" cy="4429125"/>
             <wp:effectExtent l="0" t="0" r="0" b="0"/>
             <wp:docPr id="13" name="Immagine 13"/>
@@ -16949,7 +16927,7 @@
       <w:pPr>
         <w:pStyle w:val="Titolo2"/>
       </w:pPr>
-      <w:bookmarkStart w:id="38" w:name="_Toc243648808"/>
+      <w:bookmarkStart w:id="38" w:name="_Toc243650699"/>
       <w:r>
         <w:t>6.7 Release 1.1.0</w:t>
       </w:r>
@@ -17513,9 +17491,8 @@
       <w:pPr>
         <w:pStyle w:val="Titolo2"/>
       </w:pPr>
-      <w:bookmarkStart w:id="39" w:name="_Toc243648809"/>
-      <w:r>
-        <w:lastRenderedPageBreak/>
+      <w:bookmarkStart w:id="39" w:name="_Toc243650700"/>
+      <w:r>
         <w:t>6.8 Versione 1.2.0</w:t>
       </w:r>
       <w:bookmarkEnd w:id="39"/>
@@ -18063,7 +18040,7 @@
       <w:pPr>
         <w:pStyle w:val="Titolo2"/>
       </w:pPr>
-      <w:bookmarkStart w:id="40" w:name="_Toc243648810"/>
+      <w:bookmarkStart w:id="40" w:name="_Toc243650701"/>
       <w:r>
         <w:t>6.9 Versione 1.2.1</w:t>
       </w:r>
@@ -18081,7 +18058,7 @@
       <w:pPr>
         <w:pStyle w:val="Titolo2"/>
       </w:pPr>
-      <w:bookmarkStart w:id="41" w:name="_Toc243648811"/>
+      <w:bookmarkStart w:id="41" w:name="_Toc243650702"/>
       <w:r>
         <w:t>6.10 Versione 1.3.0</w:t>
       </w:r>
@@ -18113,7 +18090,7 @@
       <w:pPr>
         <w:pStyle w:val="Titolo2"/>
       </w:pPr>
-      <w:bookmarkStart w:id="42" w:name="_Toc243648812"/>
+      <w:bookmarkStart w:id="42" w:name="_Toc243650703"/>
       <w:r>
         <w:t>6.11 Versione 1.3.1 (ponte verso Cloudflare)</w:t>
       </w:r>
@@ -18124,14 +18101,14 @@
         <w:spacing w:after="120"/>
       </w:pPr>
       <w:r>
-        <w:t>Preparata il 23 ottobre 2026: compilata con l'indirizzo degli aggiornamenti https://pdfz.pages.dev/ (installer Windows 101.3.1, Android 1001003001). Esce ancora anche nella GitHub Release, così le app fino alla 1.3.0 la trovano; dopo che è installata su tutti i dispositivi l'autore può rendere privato il repository.</w:t>
+        <w:t>Pubblicata il 23 ottobre 2026 (release in 7 minuti, sito Cloudflare aggiornato da solo 2 minuti dopo): compilata con l'indirizzo degli aggiornamenti https://pdfz.pages.dev/ (installer Windows 101.3.1, Android 1001003001). Esce ancora anche nella GitHub Release, così le app fino alla 1.3.0 la trovano; dopo che è installata su tutti i dispositivi l'autore può rendere privato il repository.</w:t>
       </w:r>
     </w:p>
     <w:p>
       <w:pPr>
         <w:pStyle w:val="Titolo2"/>
       </w:pPr>
-      <w:bookmarkStart w:id="43" w:name="_Toc243648813"/>
+      <w:bookmarkStart w:id="43" w:name="_Toc243650704"/>
       <w:r>
         <w:t>6.12 Ruoli</w:t>
       </w:r>
@@ -18404,7 +18381,7 @@
       <w:pPr>
         <w:pStyle w:val="Titolo1"/>
       </w:pPr>
-      <w:bookmarkStart w:id="44" w:name="_Toc243648814"/>
+      <w:bookmarkStart w:id="44" w:name="_Toc243650705"/>
       <w:r>
         <w:t>7. Sicurezza</w:t>
       </w:r>
@@ -18433,7 +18410,6 @@
         <w:spacing w:after="60"/>
       </w:pPr>
       <w:r>
-        <w:lastRenderedPageBreak/>
         <w:t>I file eseguibili prodotti (es. estratti da un .p7m) non vengono mai aperti direttamente.</w:t>
       </w:r>
     </w:p>
@@ -18704,7 +18680,7 @@
       <w:pPr>
         <w:pStyle w:val="Titolo1"/>
       </w:pPr>
-      <w:bookmarkStart w:id="45" w:name="_Toc243648815"/>
+      <w:bookmarkStart w:id="45" w:name="_Toc243650706"/>
       <w:r>
         <w:t>8. Punti aperti</w:t>
       </w:r>
@@ -18933,7 +18909,7 @@
       <w:pPr>
         <w:pStyle w:val="Titolo1"/>
       </w:pPr>
-      <w:bookmarkStart w:id="46" w:name="_Toc243648816"/>
+      <w:bookmarkStart w:id="46" w:name="_Toc243650707"/>
       <w:r>
         <w:t>9. Pensato per i prossimi 10 anni</w:t>
       </w:r>
@@ -19211,150 +19187,150 @@
 <file path=word/numbering.xml><?xml version="1.0" encoding="utf-8"?>
 <w:numbering xmlns:wpc="http://schemas.microsoft.com/office/word/2010/wordprocessingCanvas" xmlns:cx="http://schemas.microsoft.com/office/drawing/2014/chartex" xmlns:cx1="http://schemas.microsoft.com/office/drawing/2015/9/8/chartex" xmlns:cx2="http://schemas.microsoft.com/office/drawing/2015/10/21/chartex" xmlns:cx3="http://schemas.microsoft.com/office/drawing/2016/5/9/chartex" xmlns:cx4="http://schemas.microsoft.com/office/drawing/2016/5/10/chartex" xmlns:cx5="http://schemas.microsoft.com/office/drawing/2016/5/11/chartex" xmlns:cx6="http://schemas.microsoft.com/office/drawing/2016/5/12/chartex" xmlns:cx7="http://schemas.microsoft.com/office/drawing/2016/5/13/chartex" xmlns:cx8="http://schemas.microsoft.com/office/drawing/2016/5/14/chartex" xmlns:mc="http://schemas.openxmlformats.org/markup-compatibility/2006" xmlns:aink="http://schemas.microsoft.com/office/drawing/2016/ink" xmlns:am3d="http://schemas.microsoft.com/office/drawing/2017/model3d" xmlns:o="urn:schemas-microsoft-com:office:office" xmlns:oel="http://schemas.microsoft.com/office/2019/extlst" xmlns:r="http://schemas.openxmlformats.org/officeDocument/2006/relationships" xmlns:m="http://schemas.openxmlformats.org/officeDocument/2006/math" xmlns:v="urn:schemas-microsoft-com:vml" xmlns:wp14="http://schemas.microsoft.com/office/word/2010/wordprocessingDrawing" xmlns:wp="http://schemas.openxmlformats.org/drawingml/2006/wordprocessingDrawing" xmlns:w10="urn:schemas-microsoft-com:office:word" xmlns:w="http://schemas.openxmlformats.org/wordprocessingml/2006/main" xmlns:w14="http://schemas.microsoft.com/office/word/2010/wordml" xmlns:w15="http://schemas.microsoft.com/office/word/2012/wordml" xmlns:w16cex="http://schemas.microsoft.com/office/word/2018/wordml/cex" xmlns:w16cid="http://schemas.microsoft.com/office/word/2016/wordml/cid" xmlns:w16="http://schemas.microsoft.com/office/word/2018/wordml" xmlns:w16du="http://schemas.microsoft.com/office/word/2023/wordml/word16du" xmlns:w16sdtdh="http://schemas.microsoft.com/office/word/2020/wordml/sdtdatahash" xmlns:w16sdtfl="http://schemas.microsoft.com/office/word/2024/wordml/sdtformatlock" xmlns:w16se="http://schemas.microsoft.com/office/word/2015/wordml/symex" xmlns:wpg="http://schemas.microsoft.com/office/word/2010/wordprocessingGroup" xmlns:wpi="http://schemas.microsoft.com/office/word/2010/wordprocessingInk" xmlns:wne="http://schemas.microsoft.com/office/word/2006/wordml" xmlns:wps="http://schemas.microsoft.com/office/word/2010/wordprocessingShape" mc:Ignorable="w14 w15 w16se w16cid w16 w16cex w16sdtdh w16sdtfl w16du wp14">
   <w:abstractNum w:abstractNumId="0" w15:restartNumberingAfterBreak="0">
-    <w:nsid w:val="416F0530"/>
+    <w:nsid w:val="36C01E80"/>
     <w:multiLevelType w:val="hybridMultilevel"/>
-    <w:tmpl w:val="7FC05F86"/>
-    <w:lvl w:ilvl="0" w:tplc="F574F3D8" w:tentative="1">
+    <w:tmpl w:val="8DF09E76"/>
+    <w:lvl w:ilvl="0" w:tplc="85102858">
       <w:start w:val="1"/>
-      <w:numFmt w:val="bullet"/>
-      <w:lvlText w:val="●"/>
+      <w:numFmt w:val="decimal"/>
+      <w:lvlText w:val="%1."/>
       <w:lvlJc w:val="left"/>
       <w:pPr>
-        <w:ind w:left="720" w:hanging="360"/>
+        <w:ind w:left="540" w:hanging="300"/>
       </w:pPr>
     </w:lvl>
-    <w:lvl w:ilvl="1" w:tplc="6924118E" w:tentative="1">
-      <w:start w:val="1"/>
-      <w:numFmt w:val="bullet"/>
-      <w:lvlText w:val="○"/>
-      <w:lvlJc w:val="left"/>
-      <w:pPr>
-        <w:ind w:left="1440" w:hanging="360"/>
-      </w:pPr>
-    </w:lvl>
-    <w:lvl w:ilvl="2" w:tplc="D2AE1940" w:tentative="1">
-      <w:start w:val="1"/>
-      <w:numFmt w:val="bullet"/>
-      <w:lvlText w:val="■"/>
-      <w:lvlJc w:val="left"/>
-      <w:pPr>
-        <w:ind w:left="2160" w:hanging="360"/>
-      </w:pPr>
-    </w:lvl>
-    <w:lvl w:ilvl="3" w:tplc="23EEB814" w:tentative="1">
-      <w:start w:val="1"/>
-      <w:numFmt w:val="bullet"/>
-      <w:lvlText w:val="●"/>
-      <w:lvlJc w:val="left"/>
-      <w:pPr>
-        <w:ind w:left="2880" w:hanging="360"/>
-      </w:pPr>
-    </w:lvl>
-    <w:lvl w:ilvl="4" w:tplc="6D62E710" w:tentative="1">
-      <w:start w:val="1"/>
-      <w:numFmt w:val="bullet"/>
-      <w:lvlText w:val="○"/>
-      <w:lvlJc w:val="left"/>
-      <w:pPr>
-        <w:ind w:left="3600" w:hanging="360"/>
-      </w:pPr>
-    </w:lvl>
-    <w:lvl w:ilvl="5" w:tplc="CC8CBC44" w:tentative="1">
-      <w:start w:val="1"/>
-      <w:numFmt w:val="bullet"/>
-      <w:lvlText w:val="■"/>
-      <w:lvlJc w:val="left"/>
-      <w:pPr>
-        <w:ind w:left="4320" w:hanging="360"/>
-      </w:pPr>
-    </w:lvl>
-    <w:lvl w:ilvl="6" w:tplc="0DEC6474" w:tentative="1">
-      <w:start w:val="1"/>
-      <w:numFmt w:val="bullet"/>
-      <w:lvlText w:val="●"/>
-      <w:lvlJc w:val="left"/>
-      <w:pPr>
-        <w:ind w:left="5040" w:hanging="360"/>
-      </w:pPr>
-    </w:lvl>
-    <w:lvl w:ilvl="7" w:tplc="0CB4D446" w:tentative="1">
-      <w:start w:val="1"/>
-      <w:numFmt w:val="bullet"/>
-      <w:lvlText w:val="●"/>
-      <w:lvlJc w:val="left"/>
-      <w:pPr>
-        <w:ind w:left="5760" w:hanging="360"/>
-      </w:pPr>
-    </w:lvl>
-    <w:lvl w:ilvl="8" w:tplc="F7F87E3A" w:tentative="1">
-      <w:start w:val="1"/>
-      <w:numFmt w:val="bullet"/>
-      <w:lvlText w:val="●"/>
-      <w:lvlJc w:val="left"/>
-      <w:pPr>
-        <w:ind w:left="6480" w:hanging="360"/>
-      </w:pPr>
-    </w:lvl>
-  </w:abstractNum>
-  <w:abstractNum w:abstractNumId="1" w15:restartNumberingAfterBreak="0">
-    <w:nsid w:val="5F8A06FB"/>
-    <w:multiLevelType w:val="hybridMultilevel"/>
-    <w:tmpl w:val="E6724A70"/>
-    <w:lvl w:ilvl="0" w:tplc="FE9072BE">
-      <w:start w:val="1"/>
-      <w:numFmt w:val="bullet"/>
-      <w:lvlText w:val="•"/>
-      <w:lvlJc w:val="left"/>
-      <w:pPr>
-        <w:ind w:left="540" w:hanging="270"/>
-      </w:pPr>
-    </w:lvl>
-    <w:lvl w:ilvl="1" w:tplc="49AA6FE2">
+    <w:lvl w:ilvl="1" w:tplc="03262E42">
       <w:numFmt w:val="decimal"/>
       <w:lvlText w:val=""/>
       <w:lvlJc w:val="left"/>
     </w:lvl>
-    <w:lvl w:ilvl="2" w:tplc="C16E0D78">
+    <w:lvl w:ilvl="2" w:tplc="21923298">
       <w:numFmt w:val="decimal"/>
       <w:lvlText w:val=""/>
       <w:lvlJc w:val="left"/>
     </w:lvl>
-    <w:lvl w:ilvl="3" w:tplc="32BCBBB4">
+    <w:lvl w:ilvl="3" w:tplc="7CE6EF00">
       <w:numFmt w:val="decimal"/>
       <w:lvlText w:val=""/>
       <w:lvlJc w:val="left"/>
     </w:lvl>
-    <w:lvl w:ilvl="4" w:tplc="766478AC">
+    <w:lvl w:ilvl="4" w:tplc="896A1C56">
       <w:numFmt w:val="decimal"/>
       <w:lvlText w:val=""/>
       <w:lvlJc w:val="left"/>
     </w:lvl>
-    <w:lvl w:ilvl="5" w:tplc="D55E2614">
+    <w:lvl w:ilvl="5" w:tplc="9836E440">
       <w:numFmt w:val="decimal"/>
       <w:lvlText w:val=""/>
       <w:lvlJc w:val="left"/>
     </w:lvl>
-    <w:lvl w:ilvl="6" w:tplc="253E29CC">
+    <w:lvl w:ilvl="6" w:tplc="EC728492">
       <w:numFmt w:val="decimal"/>
       <w:lvlText w:val=""/>
       <w:lvlJc w:val="left"/>
     </w:lvl>
-    <w:lvl w:ilvl="7" w:tplc="E1A4F23C">
+    <w:lvl w:ilvl="7" w:tplc="77209702">
       <w:numFmt w:val="decimal"/>
       <w:lvlText w:val=""/>
       <w:lvlJc w:val="left"/>
     </w:lvl>
-    <w:lvl w:ilvl="8" w:tplc="6D967CDC">
+    <w:lvl w:ilvl="8" w:tplc="C74685D8">
       <w:numFmt w:val="decimal"/>
       <w:lvlText w:val=""/>
       <w:lvlJc w:val="left"/>
     </w:lvl>
   </w:abstractNum>
+  <w:abstractNum w:abstractNumId="1" w15:restartNumberingAfterBreak="0">
+    <w:nsid w:val="531C2AEB"/>
+    <w:multiLevelType w:val="hybridMultilevel"/>
+    <w:tmpl w:val="069E3456"/>
+    <w:lvl w:ilvl="0" w:tplc="44469BA0" w:tentative="1">
+      <w:start w:val="1"/>
+      <w:numFmt w:val="bullet"/>
+      <w:lvlText w:val="●"/>
+      <w:lvlJc w:val="left"/>
+      <w:pPr>
+        <w:ind w:left="720" w:hanging="360"/>
+      </w:pPr>
+    </w:lvl>
+    <w:lvl w:ilvl="1" w:tplc="DCC2C058" w:tentative="1">
+      <w:start w:val="1"/>
+      <w:numFmt w:val="bullet"/>
+      <w:lvlText w:val="○"/>
+      <w:lvlJc w:val="left"/>
+      <w:pPr>
+        <w:ind w:left="1440" w:hanging="360"/>
+      </w:pPr>
+    </w:lvl>
+    <w:lvl w:ilvl="2" w:tplc="AA9CD1A0" w:tentative="1">
+      <w:start w:val="1"/>
+      <w:numFmt w:val="bullet"/>
+      <w:lvlText w:val="■"/>
+      <w:lvlJc w:val="left"/>
+      <w:pPr>
+        <w:ind w:left="2160" w:hanging="360"/>
+      </w:pPr>
+    </w:lvl>
+    <w:lvl w:ilvl="3" w:tplc="61044942" w:tentative="1">
+      <w:start w:val="1"/>
+      <w:numFmt w:val="bullet"/>
+      <w:lvlText w:val="●"/>
+      <w:lvlJc w:val="left"/>
+      <w:pPr>
+        <w:ind w:left="2880" w:hanging="360"/>
+      </w:pPr>
+    </w:lvl>
+    <w:lvl w:ilvl="4" w:tplc="EE8ADDEC" w:tentative="1">
+      <w:start w:val="1"/>
+      <w:numFmt w:val="bullet"/>
+      <w:lvlText w:val="○"/>
+      <w:lvlJc w:val="left"/>
+      <w:pPr>
+        <w:ind w:left="3600" w:hanging="360"/>
+      </w:pPr>
+    </w:lvl>
+    <w:lvl w:ilvl="5" w:tplc="53E62F68" w:tentative="1">
+      <w:start w:val="1"/>
+      <w:numFmt w:val="bullet"/>
+      <w:lvlText w:val="■"/>
+      <w:lvlJc w:val="left"/>
+      <w:pPr>
+        <w:ind w:left="4320" w:hanging="360"/>
+      </w:pPr>
+    </w:lvl>
+    <w:lvl w:ilvl="6" w:tplc="24288D20" w:tentative="1">
+      <w:start w:val="1"/>
+      <w:numFmt w:val="bullet"/>
+      <w:lvlText w:val="●"/>
+      <w:lvlJc w:val="left"/>
+      <w:pPr>
+        <w:ind w:left="5040" w:hanging="360"/>
+      </w:pPr>
+    </w:lvl>
+    <w:lvl w:ilvl="7" w:tplc="9E303324" w:tentative="1">
+      <w:start w:val="1"/>
+      <w:numFmt w:val="bullet"/>
+      <w:lvlText w:val="●"/>
+      <w:lvlJc w:val="left"/>
+      <w:pPr>
+        <w:ind w:left="5760" w:hanging="360"/>
+      </w:pPr>
+    </w:lvl>
+    <w:lvl w:ilvl="8" w:tplc="732E192C" w:tentative="1">
+      <w:start w:val="1"/>
+      <w:numFmt w:val="bullet"/>
+      <w:lvlText w:val="●"/>
+      <w:lvlJc w:val="left"/>
+      <w:pPr>
+        <w:ind w:left="6480" w:hanging="360"/>
+      </w:pPr>
+    </w:lvl>
+  </w:abstractNum>
   <w:abstractNum w:abstractNumId="2" w15:restartNumberingAfterBreak="0">
-    <w:nsid w:val="639B7512"/>
+    <w:nsid w:val="5D6F25B2"/>
     <w:multiLevelType w:val="hybridMultilevel"/>
-    <w:tmpl w:val="2DD013BC"/>
-    <w:lvl w:ilvl="0" w:tplc="7060B566">
+    <w:tmpl w:val="C0CE4B98"/>
+    <w:lvl w:ilvl="0" w:tplc="98DA486E">
       <w:start w:val="1"/>
       <w:numFmt w:val="decimal"/>
       <w:lvlText w:val="%1."/>
@@ -19363,121 +19339,121 @@
         <w:ind w:left="540" w:hanging="300"/>
       </w:pPr>
     </w:lvl>
-    <w:lvl w:ilvl="1" w:tplc="B7B0626C">
+    <w:lvl w:ilvl="1" w:tplc="25F0AFA4">
       <w:numFmt w:val="decimal"/>
       <w:lvlText w:val=""/>
       <w:lvlJc w:val="left"/>
     </w:lvl>
-    <w:lvl w:ilvl="2" w:tplc="59C2F4AE">
+    <w:lvl w:ilvl="2" w:tplc="BB1CA80C">
       <w:numFmt w:val="decimal"/>
       <w:lvlText w:val=""/>
       <w:lvlJc w:val="left"/>
     </w:lvl>
-    <w:lvl w:ilvl="3" w:tplc="7BE47268">
+    <w:lvl w:ilvl="3" w:tplc="6F5EEE0E">
       <w:numFmt w:val="decimal"/>
       <w:lvlText w:val=""/>
       <w:lvlJc w:val="left"/>
     </w:lvl>
-    <w:lvl w:ilvl="4" w:tplc="6492AF88">
+    <w:lvl w:ilvl="4" w:tplc="25D011EA">
       <w:numFmt w:val="decimal"/>
       <w:lvlText w:val=""/>
       <w:lvlJc w:val="left"/>
     </w:lvl>
-    <w:lvl w:ilvl="5" w:tplc="A92EFE68">
+    <w:lvl w:ilvl="5" w:tplc="83E08C82">
       <w:numFmt w:val="decimal"/>
       <w:lvlText w:val=""/>
       <w:lvlJc w:val="left"/>
     </w:lvl>
-    <w:lvl w:ilvl="6" w:tplc="79985258">
+    <w:lvl w:ilvl="6" w:tplc="E51058E6">
       <w:numFmt w:val="decimal"/>
       <w:lvlText w:val=""/>
       <w:lvlJc w:val="left"/>
     </w:lvl>
-    <w:lvl w:ilvl="7" w:tplc="55B214EE">
+    <w:lvl w:ilvl="7" w:tplc="EB92CED6">
       <w:numFmt w:val="decimal"/>
       <w:lvlText w:val=""/>
       <w:lvlJc w:val="left"/>
     </w:lvl>
-    <w:lvl w:ilvl="8" w:tplc="4C58304C">
+    <w:lvl w:ilvl="8" w:tplc="9F24B2F2">
       <w:numFmt w:val="decimal"/>
       <w:lvlText w:val=""/>
       <w:lvlJc w:val="left"/>
     </w:lvl>
   </w:abstractNum>
   <w:abstractNum w:abstractNumId="3" w15:restartNumberingAfterBreak="0">
-    <w:nsid w:val="65E00CCF"/>
+    <w:nsid w:val="67B976F3"/>
     <w:multiLevelType w:val="hybridMultilevel"/>
-    <w:tmpl w:val="124AE70C"/>
-    <w:lvl w:ilvl="0" w:tplc="7C9AA27C">
+    <w:tmpl w:val="54468712"/>
+    <w:lvl w:ilvl="0" w:tplc="3D0AF9D6">
       <w:start w:val="1"/>
-      <w:numFmt w:val="decimal"/>
-      <w:lvlText w:val="%1."/>
+      <w:numFmt w:val="bullet"/>
+      <w:lvlText w:val="•"/>
       <w:lvlJc w:val="left"/>
       <w:pPr>
-        <w:ind w:left="540" w:hanging="300"/>
+        <w:ind w:left="540" w:hanging="270"/>
       </w:pPr>
     </w:lvl>
-    <w:lvl w:ilvl="1" w:tplc="F828C7EE">
+    <w:lvl w:ilvl="1" w:tplc="3B965BBC">
       <w:numFmt w:val="decimal"/>
       <w:lvlText w:val=""/>
       <w:lvlJc w:val="left"/>
     </w:lvl>
-    <w:lvl w:ilvl="2" w:tplc="B2E0F0E6">
+    <w:lvl w:ilvl="2" w:tplc="9CA02374">
       <w:numFmt w:val="decimal"/>
       <w:lvlText w:val=""/>
       <w:lvlJc w:val="left"/>
     </w:lvl>
-    <w:lvl w:ilvl="3" w:tplc="647C434C">
+    <w:lvl w:ilvl="3" w:tplc="8534B1DA">
       <w:numFmt w:val="decimal"/>
       <w:lvlText w:val=""/>
       <w:lvlJc w:val="left"/>
     </w:lvl>
-    <w:lvl w:ilvl="4" w:tplc="1CA68AD4">
+    <w:lvl w:ilvl="4" w:tplc="984C0C76">
       <w:numFmt w:val="decimal"/>
       <w:lvlText w:val=""/>
       <w:lvlJc w:val="left"/>
     </w:lvl>
-    <w:lvl w:ilvl="5" w:tplc="72581A68">
+    <w:lvl w:ilvl="5" w:tplc="498AC428">
       <w:numFmt w:val="decimal"/>
       <w:lvlText w:val=""/>
       <w:lvlJc w:val="left"/>
     </w:lvl>
-    <w:lvl w:ilvl="6" w:tplc="856E5BE4">
+    <w:lvl w:ilvl="6" w:tplc="B74EE494">
       <w:numFmt w:val="decimal"/>
       <w:lvlText w:val=""/>
       <w:lvlJc w:val="left"/>
     </w:lvl>
-    <w:lvl w:ilvl="7" w:tplc="9C001FD6">
+    <w:lvl w:ilvl="7" w:tplc="AC140CC0">
       <w:numFmt w:val="decimal"/>
       <w:lvlText w:val=""/>
       <w:lvlJc w:val="left"/>
     </w:lvl>
-    <w:lvl w:ilvl="8" w:tplc="9EC0A30E">
+    <w:lvl w:ilvl="8" w:tplc="918638DA">
       <w:numFmt w:val="decimal"/>
       <w:lvlText w:val=""/>
       <w:lvlJc w:val="left"/>
     </w:lvl>
   </w:abstractNum>
-  <w:num w:numId="1" w16cid:durableId="1852064818">
-    <w:abstractNumId w:val="0"/>
-    <w:lvlOverride w:ilvl="0">
-      <w:startOverride w:val="1"/>
-    </w:lvlOverride>
-  </w:num>
-  <w:num w:numId="2" w16cid:durableId="195849206">
+  <w:num w:numId="1" w16cid:durableId="504588461">
     <w:abstractNumId w:val="1"/>
     <w:lvlOverride w:ilvl="0">
       <w:startOverride w:val="1"/>
     </w:lvlOverride>
   </w:num>
-  <w:num w:numId="3" w16cid:durableId="1019545340">
+  <w:num w:numId="2" w16cid:durableId="2097746004">
     <w:abstractNumId w:val="3"/>
     <w:lvlOverride w:ilvl="0">
       <w:startOverride w:val="1"/>
     </w:lvlOverride>
   </w:num>
-  <w:num w:numId="4" w16cid:durableId="1380712894">
+  <w:num w:numId="3" w16cid:durableId="1466510223">
     <w:abstractNumId w:val="2"/>
+    <w:lvlOverride w:ilvl="0">
+      <w:startOverride w:val="1"/>
+    </w:lvlOverride>
+  </w:num>
+  <w:num w:numId="4" w16cid:durableId="1085495008">
+    <w:abstractNumId w:val="0"/>
     <w:lvlOverride w:ilvl="0">
       <w:startOverride w:val="1"/>
     </w:lvlOverride>
@@ -20118,7 +20094,7 @@
     <w:autoRedefine/>
     <w:uiPriority w:val="39"/>
     <w:unhideWhenUsed/>
-    <w:rsid w:val="002A1BE2"/>
+    <w:rsid w:val="00DB5104"/>
     <w:pPr>
       <w:spacing w:after="100"/>
     </w:pPr>
@@ -20130,7 +20106,7 @@
     <w:autoRedefine/>
     <w:uiPriority w:val="39"/>
     <w:unhideWhenUsed/>
-    <w:rsid w:val="002A1BE2"/>
+    <w:rsid w:val="00DB5104"/>
     <w:pPr>
       <w:spacing w:after="100"/>
       <w:ind w:left="210"/>

</xml_diff>